<commit_message>
docs: design spec rev 1.1 - embedded designer ad hoc views, live-run findings and results
Co-Authored-By: Claude Fable 5.1 <noreply@anthropic.com>
</commit_message>
<xml_diff>
--- a/docs/Jaspersoft-Connector-Phase1-Design-Spec.docx
+++ b/docs/Jaspersoft-Connector-Phase1-Design-Spec.docx
@@ -249,7 +249,7 @@
                 <w:sz w:val="19"/>
                 <w:szCs w:val="19"/>
               </w:rPr>
-              <w:t xml:space="preserve">C:\Users\rgorsuch\jrs-meta, branch feature/phase1-connector</w:t>
+              <w:t xml:space="preserve">https://github.com/robertgorsuch/jrs-meta (main, 96f573c)</w:t>
             </w:r>
           </w:p>
         </w:tc>
@@ -315,7 +315,7 @@
                 <w:sz w:val="19"/>
                 <w:szCs w:val="19"/>
               </w:rPr>
-              <w:t xml:space="preserve">Phase 1 implemented and independently code-reviewed; review fixes applied; 114 unit tests passing; live-server smoke test pending credentials</w:t>
+              <w:t xml:space="preserve">Phase 1 implemented and independently code-reviewed; review fixes applied; 118 unit tests passing; live smoke test and full repository crawl executed against JasperReports Server 10.0.0 PRO (1,233 resources, 0 failures, 0 unresolved lineage edges)</w:t>
             </w:r>
           </w:p>
         </w:tc>
@@ -447,7 +447,73 @@
                 <w:sz w:val="19"/>
                 <w:szCs w:val="19"/>
               </w:rPr>
-              <w:t xml:space="preserve">2026-10-12</w:t>
+              <w:t xml:space="preserve">2026-10-13 (revision 1.1)</w:t>
+            </w:r>
+          </w:p>
+        </w:tc>
+      </w:tr>
+      <w:tr>
+        <w:tc>
+          <w:tcPr>
+            <w:tcW w:type="dxa" w:w="2520"/>
+            <w:tcBorders>
+              <w:top w:val="single" w:color="BFBFBF" w:sz="4"/>
+              <w:left w:val="single" w:color="BFBFBF" w:sz="4"/>
+              <w:bottom w:val="single" w:color="BFBFBF" w:sz="4"/>
+              <w:right w:val="single" w:color="BFBFBF" w:sz="4"/>
+            </w:tcBorders>
+            <w:tcMar>
+              <w:top w:type="dxa" w:w="60"/>
+              <w:left w:type="dxa" w:w="100"/>
+              <w:bottom w:type="dxa" w:w="60"/>
+              <w:right w:type="dxa" w:w="100"/>
+            </w:tcMar>
+          </w:tcPr>
+          <w:p>
+            <w:pPr>
+              <w:spacing w:after="0" w:line="252"/>
+            </w:pPr>
+            <w:r>
+              <w:rPr>
+                <w:rFonts w:ascii="Calibri" w:cs="Calibri" w:eastAsia="Calibri" w:hAnsi="Calibri"/>
+                <w:b w:val="false"/>
+                <w:bCs w:val="false"/>
+                <w:sz w:val="19"/>
+                <w:szCs w:val="19"/>
+              </w:rPr>
+              <w:t xml:space="preserve">Revision history</w:t>
+            </w:r>
+          </w:p>
+        </w:tc>
+        <w:tc>
+          <w:tcPr>
+            <w:tcW w:type="dxa" w:w="7560"/>
+            <w:tcBorders>
+              <w:top w:val="single" w:color="BFBFBF" w:sz="4"/>
+              <w:left w:val="single" w:color="BFBFBF" w:sz="4"/>
+              <w:bottom w:val="single" w:color="BFBFBF" w:sz="4"/>
+              <w:right w:val="single" w:color="BFBFBF" w:sz="4"/>
+            </w:tcBorders>
+            <w:tcMar>
+              <w:top w:type="dxa" w:w="60"/>
+              <w:left w:type="dxa" w:w="100"/>
+              <w:bottom w:type="dxa" w:w="60"/>
+              <w:right w:type="dxa" w:w="100"/>
+            </w:tcMar>
+          </w:tcPr>
+          <w:p>
+            <w:pPr>
+              <w:spacing w:after="0" w:line="252"/>
+            </w:pPr>
+            <w:r>
+              <w:rPr>
+                <w:rFonts w:ascii="Calibri" w:cs="Calibri" w:eastAsia="Calibri" w:hAnsi="Calibri"/>
+                <w:b w:val="false"/>
+                <w:bCs w:val="false"/>
+                <w:sz w:val="19"/>
+                <w:szCs w:val="19"/>
+              </w:rPr>
+              <w:t xml:space="preserve">1.0 (2026-10-12): as built after independent review. 1.1 (2026-10-13): live-server findings (relative subreport references, local _files references, resources wrapper) and lineage through embedded designer ad hoc views (sections 6.4.1, 10, 14).</w:t>
             </w:r>
           </w:p>
         </w:tc>
@@ -582,7 +648,7 @@
           <w:sz w:val="22"/>
           <w:szCs w:val="22"/>
         </w:rPr>
-        <w:t xml:space="preserve">This document specifies the design of the Phase 1 Jaspersoft connector as implemented. It is derived from the product design document (the spec) and the implementation plan, and reflects the code on the feature branch. It is the reference for anyone extending the connector (Phase 2 column lineage, catalog API emitter) or operating it.</w:t>
+        <w:t xml:space="preserve">This document specifies the design of the Phase 1 Jaspersoft connector as implemented. It is derived from the product design document (the spec) and the implementation plan, and reflects the code on main as of revision 1.1. It is the reference for anyone extending the connector (Phase 2 column lineage, catalog API emitter) or operating it.</w:t>
       </w:r>
     </w:p>
     <w:p>
@@ -4305,7 +4371,7 @@
                 <w:sz w:val="19"/>
                 <w:szCs w:val="19"/>
               </w:rPr>
-              <w:t xml:space="preserve">DASHBOARD_TILE</w:t>
+              <w:t xml:space="preserve">DASHBOARD_TILE; BI_VIEW for designer ad hoc views embedded in the dashboard export (6.4.1)</w:t>
             </w:r>
           </w:p>
         </w:tc>
@@ -5284,7 +5350,7 @@
           <w:sz w:val="22"/>
           <w:szCs w:val="22"/>
         </w:rPr>
-        <w:t xml:space="preserve">Parsers do not build edges. They emit Ref(fromUri, toUri, kind, attributes) where fromUri is the consumer and toUri the producer. RefKind values: DATASOURCE, QUERY_RESOURCE, SUBREPORT, INPUT_CONTROL, DASHLET, OLAP_CONNECTION, OLAP_SCHEMA, SUB_DATASOURCE. The LineageBuilder maps every kind to an edge toUri → fromUri (INPUT_CONTROL becomes PARAMETER, all others DATA_FLOW), deduplicates on (source, target, type), and flags targets not in the inventory as unresolved.</w:t>
+        <w:t xml:space="preserve">Parsers do not build edges. They emit Ref(fromUri, toUri, kind, attributes) where fromUri is the consumer and toUri the producer. RefKind values: DATASOURCE, QUERY_RESOURCE, SUBREPORT, INPUT_CONTROL, DASHLET, OLAP_CONNECTION, OLAP_SCHEMA, SUB_DATASOURCE. The LineageBuilder maps every kind to an edge toUri → fromUri (INPUT_CONTROL becomes PARAMETER, all others DATA_FLOW), deduplicates on (source, target, type), and flags targets not in the inventory as unresolved. One exception: a target under the consumer's own hidden companion folder (&lt;fromUri&gt;_files/..., e.g. a report's input controls and subreport files) is never in the listing because JRS hides *_files children; such edges are marked local=true with EXACT confidence instead of unresolved.</w:t>
       </w:r>
     </w:p>
     <w:p>
@@ -6597,7 +6663,7 @@
                 <w:sz w:val="19"/>
                 <w:szCs w:val="19"/>
               </w:rPr>
-              <w:t xml:space="preserve">reportUnit descriptor; JRXML inline (base64) or via _files reference</w:t>
+              <w:t xml:space="preserve">reportUnit descriptor; JRXML inline (base64) or via _files reference; companion resources from either the bare array or the live JRS 10 wrapper form resources:{resource:[...]}</w:t>
             </w:r>
           </w:p>
         </w:tc>
@@ -6693,7 +6759,7 @@
                 <w:sz w:val="19"/>
                 <w:szCs w:val="19"/>
               </w:rPr>
-              <w:t xml:space="preserve">queryLanguage, queryText (optionally redacted), subDatasets, variables, subreportUris, unresolvedSubreports, jrxmlSource (inline/reference/missing), alwaysPromptControls</w:t>
+              <w:t xml:space="preserve">queryLanguage, queryText (optionally redacted), subDatasets, variables, subreportUris, unresolvedSubreports, jrxmlSource (inline/reference/missing), alwaysPromptControls. Subreport expressions resolve as repo:/abs/uri, repo:Name[.jrxml] (relative to the report's companion resources, as the JRS samples use) or a quoted file name matched against companion resources.</w:t>
             </w:r>
           </w:p>
         </w:tc>
@@ -7407,7 +7473,7 @@
                 <w:sz w:val="19"/>
                 <w:szCs w:val="19"/>
               </w:rPr>
-              <w:t xml:space="preserve">export zip: _files/components.data, layout, wiring.data; falls back to descriptor</w:t>
+              <w:t xml:space="preserve">export zip: the dashboard descriptor XML (dashboardModelResource), _files/components.data, layout, wiring.data, and &lt;view&gt;_files/topicJRXML.data of embedded views; falls back to descriptor</w:t>
             </w:r>
           </w:p>
         </w:tc>
@@ -7439,7 +7505,7 @@
                 <w:sz w:val="19"/>
                 <w:szCs w:val="19"/>
               </w:rPr>
-              <w:t xml:space="preserve">BI_DASHBOARD + DASHBOARD_TILE</w:t>
+              <w:t xml:space="preserve">BI_DASHBOARD + DASHBOARD_TILE + BI_VIEW (embedded designer views, 6.4.1)</w:t>
             </w:r>
           </w:p>
         </w:tc>
@@ -7471,7 +7537,7 @@
                 <w:sz w:val="19"/>
                 <w:szCs w:val="19"/>
               </w:rPr>
-              <w:t xml:space="preserve">DASHLET per tile with a resource</w:t>
+              <w:t xml:space="preserve">DASHLET per tile with a resource; for a tile over an embedded view the DASHLET targets the view's data source (Domain, Topic or datasource) with attribute embeddedView</w:t>
             </w:r>
           </w:p>
         </w:tc>
@@ -7503,7 +7569,7 @@
                 <w:sz w:val="19"/>
                 <w:szCs w:val="19"/>
               </w:rPr>
-              <w:t xml:space="preserve">parseMode (export/descriptor), tileCount, wiring; per tile: tileType, resourceUri, dataSourceUri, x/y/width/height from the 40-column grid</w:t>
+              <w:t xml:space="preserve">parseMode (export/descriptor), tileCount, embeddedViewCount, wiring; per tile: tileType, resourceUri, dataSourceUri, x/y/width/height from the 40-column grid, embeddedView or embeddedControlOf; per embedded view: embedded=true, dataSourceUri, queryLanguage, fieldCount</w:t>
             </w:r>
           </w:p>
         </w:tc>
@@ -7833,6 +7899,129 @@
         </w:tc>
       </w:tr>
     </w:tbl>
+    <w:p>
+      <w:pPr>
+        <w:pStyle w:val="Heading3"/>
+        <w:spacing w:after="80" w:before="200"/>
+      </w:pPr>
+      <w:r>
+        <w:rPr>
+          <w:rFonts w:ascii="Calibri" w:cs="Calibri" w:eastAsia="Calibri" w:hAnsi="Calibri"/>
+        </w:rPr>
+        <w:t xml:space="preserve">6.4.1 Embedded designer ad hoc views</w:t>
+      </w:r>
+    </w:p>
+    <w:p>
+      <w:pPr>
+        <w:spacing w:after="120" w:line="276"/>
+      </w:pPr>
+      <w:r>
+        <w:rPr>
+          <w:rFonts w:ascii="Calibri" w:cs="Calibri" w:eastAsia="Calibri" w:hAnsi="Calibri"/>
+          <w:sz w:val="22"/>
+          <w:szCs w:val="22"/>
+        </w:rPr>
+        <w:t xml:space="preserve">Chart, table and crosstab tiles built in the dashboard designer do not reference a repository ad hoc view. Their components.data entry points at a URI of the form /temp/tmpAdv_&lt;timestamp&gt;_&lt;id&gt;, which does not exist in the repository: the view lives only inside the dashboard, and the export archive carries it as &lt;localResource xsi:type="adhocDataView"&gt; in the dashboard descriptor XML, with its own &lt;dataSource&gt;&lt;uri&gt; and a &lt;name&gt;_files/topicJRXML.data query. On the live server all designer-built chart tiles in the sample dashboards were of this kind, so without special handling the crawl emitted INFERRED, unresolved edges to dead /temp URIs (22 warnings on the sample repository).</w:t>
+      </w:r>
+    </w:p>
+    <w:p>
+      <w:pPr>
+        <w:spacing w:after="120" w:line="276"/>
+      </w:pPr>
+      <w:r>
+        <w:rPr>
+          <w:rFonts w:ascii="Calibri" w:cs="Calibri" w:eastAsia="Calibri" w:hAnsi="Calibri"/>
+          <w:sz w:val="22"/>
+          <w:szCs w:val="22"/>
+        </w:rPr>
+        <w:t xml:space="preserve">The parser therefore reads the embedded views from the descriptor XML first and, for each tile whose resource base name matches an embedded view:</w:t>
+      </w:r>
+    </w:p>
+    <w:p>
+      <w:pPr>
+        <w:pStyle w:val="ListParagraph"/>
+        <w:numPr>
+          <w:ilvl w:val="0"/>
+          <w:numId w:val="2"/>
+        </w:numPr>
+        <w:spacing w:after="60" w:line="264"/>
+      </w:pPr>
+      <w:r>
+        <w:rPr>
+          <w:rFonts w:ascii="Calibri" w:cs="Calibri" w:eastAsia="Calibri" w:hAnsi="Calibri"/>
+          <w:sz w:val="22"/>
+          <w:szCs w:val="22"/>
+        </w:rPr>
+        <w:t xml:space="preserve">emits the view as a child asset BI_VIEW with id &lt;dashboardId&gt;#view:&lt;name&gt;, attributes embedded=true, dataSourceUri, resourceType=adhocDataView and, when topicJRXML.data is present, queryLanguage and fieldCount;</w:t>
+      </w:r>
+    </w:p>
+    <w:p>
+      <w:pPr>
+        <w:pStyle w:val="ListParagraph"/>
+        <w:numPr>
+          <w:ilvl w:val="0"/>
+          <w:numId w:val="2"/>
+        </w:numPr>
+        <w:spacing w:after="60" w:line="264"/>
+      </w:pPr>
+      <w:r>
+        <w:rPr>
+          <w:rFonts w:ascii="Calibri" w:cs="Calibri" w:eastAsia="Calibri" w:hAnsi="Calibri"/>
+          <w:sz w:val="22"/>
+          <w:szCs w:val="22"/>
+        </w:rPr>
+        <w:t xml:space="preserve">sets embeddedView and dataSourceUri on the tile and emits the DASHLET ref from the dashboard to the view's data source (so the edge chain is datasource -&gt; Domain/Topic -&gt; dashboard, EXACT), with attributes tileId, tileType and embeddedView;</w:t>
+      </w:r>
+    </w:p>
+    <w:p>
+      <w:pPr>
+        <w:pStyle w:val="ListParagraph"/>
+        <w:numPr>
+          <w:ilvl w:val="0"/>
+          <w:numId w:val="2"/>
+        </w:numPr>
+        <w:spacing w:after="60" w:line="264"/>
+      </w:pPr>
+      <w:r>
+        <w:rPr>
+          <w:rFonts w:ascii="Calibri" w:cs="Calibri" w:eastAsia="Calibri" w:hAnsi="Calibri"/>
+          <w:sz w:val="22"/>
+          <w:szCs w:val="22"/>
+        </w:rPr>
+        <w:t xml:space="preserve">marks input-control tiles whose resource lives under &lt;view&gt;_files/ with embeddedControlOf=&lt;view&gt; and emits no edge for them (they are local to the embedded view);</w:t>
+      </w:r>
+    </w:p>
+    <w:p>
+      <w:pPr>
+        <w:pStyle w:val="ListParagraph"/>
+        <w:numPr>
+          <w:ilvl w:val="0"/>
+          <w:numId w:val="2"/>
+        </w:numPr>
+        <w:spacing w:after="60" w:line="264"/>
+      </w:pPr>
+      <w:r>
+        <w:rPr>
+          <w:rFonts w:ascii="Calibri" w:cs="Calibri" w:eastAsia="Calibri" w:hAnsi="Calibri"/>
+          <w:sz w:val="22"/>
+          <w:szCs w:val="22"/>
+        </w:rPr>
+        <w:t xml:space="preserve">warns when an embedded view declares no data source, and falls back to the plain DASHLET ref for any tile that does not match an embedded view.</w:t>
+      </w:r>
+    </w:p>
+    <w:p>
+      <w:pPr>
+        <w:spacing w:after="120" w:line="276"/>
+      </w:pPr>
+      <w:r>
+        <w:rPr>
+          <w:rFonts w:ascii="Calibri" w:cs="Calibri" w:eastAsia="Calibri" w:hAnsi="Calibri"/>
+          <w:sz w:val="22"/>
+          <w:szCs w:val="22"/>
+        </w:rPr>
+        <w:t xml:space="preserve">Result on the live sample repository: the 1._Supermart_Dashboard resolves its three chart tiles to the supermartDomain (two Domain-backed views) and to the FoodmartDataSourceJNDI datasource (one SQL topic view), and the batch has no unresolved edges. The embedded view's query text is not captured in Phase 1 (same decision as for repository ad hoc views).</w:t>
+      </w:r>
+    </w:p>
     <w:p>
       <w:pPr>
         <w:pStyle w:val="Heading2"/>
@@ -10075,6 +10264,204 @@
                 <w:sz w:val="19"/>
                 <w:szCs w:val="19"/>
               </w:rPr>
+              <w:t xml:space="preserve">Reference to a resource under the consumer's own &lt;uri&gt;_files/ folder (input controls, subreport files)</w:t>
+            </w:r>
+          </w:p>
+        </w:tc>
+        <w:tc>
+          <w:tcPr>
+            <w:tcW w:type="dxa" w:w="6574"/>
+            <w:tcBorders>
+              <w:top w:val="single" w:color="BFBFBF" w:sz="4"/>
+              <w:left w:val="single" w:color="BFBFBF" w:sz="4"/>
+              <w:bottom w:val="single" w:color="BFBFBF" w:sz="4"/>
+              <w:right w:val="single" w:color="BFBFBF" w:sz="4"/>
+            </w:tcBorders>
+            <w:tcMar>
+              <w:top w:type="dxa" w:w="60"/>
+              <w:left w:type="dxa" w:w="100"/>
+              <w:bottom w:type="dxa" w:w="60"/>
+              <w:right w:type="dxa" w:w="100"/>
+            </w:tcMar>
+          </w:tcPr>
+          <w:p>
+            <w:pPr>
+              <w:spacing w:after="0" w:line="252"/>
+            </w:pPr>
+            <w:r>
+              <w:rPr>
+                <w:rFonts w:ascii="Calibri" w:cs="Calibri" w:eastAsia="Calibri" w:hAnsi="Calibri"/>
+                <w:b w:val="false"/>
+                <w:bCs w:val="false"/>
+                <w:sz w:val="19"/>
+                <w:szCs w:val="19"/>
+              </w:rPr>
+              <w:t xml:space="preserve">Edge emitted with local=true and EXACT confidence; no warning (JRS hides *_files children from listings).</w:t>
+            </w:r>
+          </w:p>
+        </w:tc>
+      </w:tr>
+      <w:tr>
+        <w:tc>
+          <w:tcPr>
+            <w:tcW w:type="dxa" w:w="3506"/>
+            <w:tcBorders>
+              <w:top w:val="single" w:color="BFBFBF" w:sz="4"/>
+              <w:left w:val="single" w:color="BFBFBF" w:sz="4"/>
+              <w:bottom w:val="single" w:color="BFBFBF" w:sz="4"/>
+              <w:right w:val="single" w:color="BFBFBF" w:sz="4"/>
+            </w:tcBorders>
+            <w:tcMar>
+              <w:top w:type="dxa" w:w="60"/>
+              <w:left w:type="dxa" w:w="100"/>
+              <w:bottom w:type="dxa" w:w="60"/>
+              <w:right w:type="dxa" w:w="100"/>
+            </w:tcMar>
+          </w:tcPr>
+          <w:p>
+            <w:pPr>
+              <w:spacing w:after="0" w:line="252"/>
+            </w:pPr>
+            <w:r>
+              <w:rPr>
+                <w:rFonts w:ascii="Calibri" w:cs="Calibri" w:eastAsia="Calibri" w:hAnsi="Calibri"/>
+                <w:b w:val="false"/>
+                <w:bCs w:val="false"/>
+                <w:sz w:val="19"/>
+                <w:szCs w:val="19"/>
+              </w:rPr>
+              <w:t xml:space="preserve">Dashboard tile references a designer view that exists only inside the export (/temp/tmpAdv_*)</w:t>
+            </w:r>
+          </w:p>
+        </w:tc>
+        <w:tc>
+          <w:tcPr>
+            <w:tcW w:type="dxa" w:w="6574"/>
+            <w:tcBorders>
+              <w:top w:val="single" w:color="BFBFBF" w:sz="4"/>
+              <w:left w:val="single" w:color="BFBFBF" w:sz="4"/>
+              <w:bottom w:val="single" w:color="BFBFBF" w:sz="4"/>
+              <w:right w:val="single" w:color="BFBFBF" w:sz="4"/>
+            </w:tcBorders>
+            <w:tcMar>
+              <w:top w:type="dxa" w:w="60"/>
+              <w:left w:type="dxa" w:w="100"/>
+              <w:bottom w:type="dxa" w:w="60"/>
+              <w:right w:type="dxa" w:w="100"/>
+            </w:tcMar>
+          </w:tcPr>
+          <w:p>
+            <w:pPr>
+              <w:spacing w:after="0" w:line="252"/>
+            </w:pPr>
+            <w:r>
+              <w:rPr>
+                <w:rFonts w:ascii="Calibri" w:cs="Calibri" w:eastAsia="Calibri" w:hAnsi="Calibri"/>
+                <w:b w:val="false"/>
+                <w:bCs w:val="false"/>
+                <w:sz w:val="19"/>
+                <w:szCs w:val="19"/>
+              </w:rPr>
+              <w:t xml:space="preserve">The view is cataloged as an embedded BI_VIEW child and the tile's edge goes to the view's data source (6.4.1). Only a view with no data source produces a warning.</w:t>
+            </w:r>
+          </w:p>
+        </w:tc>
+      </w:tr>
+      <w:tr>
+        <w:tc>
+          <w:tcPr>
+            <w:tcW w:type="dxa" w:w="3506"/>
+            <w:tcBorders>
+              <w:top w:val="single" w:color="BFBFBF" w:sz="4"/>
+              <w:left w:val="single" w:color="BFBFBF" w:sz="4"/>
+              <w:bottom w:val="single" w:color="BFBFBF" w:sz="4"/>
+              <w:right w:val="single" w:color="BFBFBF" w:sz="4"/>
+            </w:tcBorders>
+            <w:tcMar>
+              <w:top w:type="dxa" w:w="60"/>
+              <w:left w:type="dxa" w:w="100"/>
+              <w:bottom w:type="dxa" w:w="60"/>
+              <w:right w:type="dxa" w:w="100"/>
+            </w:tcMar>
+          </w:tcPr>
+          <w:p>
+            <w:pPr>
+              <w:spacing w:after="0" w:line="252"/>
+            </w:pPr>
+            <w:r>
+              <w:rPr>
+                <w:rFonts w:ascii="Calibri" w:cs="Calibri" w:eastAsia="Calibri" w:hAnsi="Calibri"/>
+                <w:b w:val="false"/>
+                <w:bCs w:val="false"/>
+                <w:sz w:val="19"/>
+                <w:szCs w:val="19"/>
+              </w:rPr>
+              <w:t xml:space="preserve">Effective-permissions call returns 403 for a readable resource (seen for /themes/* files)</w:t>
+            </w:r>
+          </w:p>
+        </w:tc>
+        <w:tc>
+          <w:tcPr>
+            <w:tcW w:type="dxa" w:w="6574"/>
+            <w:tcBorders>
+              <w:top w:val="single" w:color="BFBFBF" w:sz="4"/>
+              <w:left w:val="single" w:color="BFBFBF" w:sz="4"/>
+              <w:bottom w:val="single" w:color="BFBFBF" w:sz="4"/>
+              <w:right w:val="single" w:color="BFBFBF" w:sz="4"/>
+            </w:tcBorders>
+            <w:tcMar>
+              <w:top w:type="dxa" w:w="60"/>
+              <w:left w:type="dxa" w:w="100"/>
+              <w:bottom w:type="dxa" w:w="60"/>
+              <w:right w:type="dxa" w:w="100"/>
+            </w:tcMar>
+          </w:tcPr>
+          <w:p>
+            <w:pPr>
+              <w:spacing w:after="0" w:line="252"/>
+            </w:pPr>
+            <w:r>
+              <w:rPr>
+                <w:rFonts w:ascii="Calibri" w:cs="Calibri" w:eastAsia="Calibri" w:hAnsi="Calibri"/>
+                <w:b w:val="false"/>
+                <w:bCs w:val="false"/>
+                <w:sz w:val="19"/>
+                <w:szCs w:val="19"/>
+              </w:rPr>
+              <w:t xml:space="preserve">Asset emitted without ACLs plus a warning per resource; not counted as a failure.</w:t>
+            </w:r>
+          </w:p>
+        </w:tc>
+      </w:tr>
+      <w:tr>
+        <w:tc>
+          <w:tcPr>
+            <w:tcW w:type="dxa" w:w="3506"/>
+            <w:tcBorders>
+              <w:top w:val="single" w:color="BFBFBF" w:sz="4"/>
+              <w:left w:val="single" w:color="BFBFBF" w:sz="4"/>
+              <w:bottom w:val="single" w:color="BFBFBF" w:sz="4"/>
+              <w:right w:val="single" w:color="BFBFBF" w:sz="4"/>
+            </w:tcBorders>
+            <w:tcMar>
+              <w:top w:type="dxa" w:w="60"/>
+              <w:left w:type="dxa" w:w="100"/>
+              <w:bottom w:type="dxa" w:w="60"/>
+              <w:right w:type="dxa" w:w="100"/>
+            </w:tcMar>
+          </w:tcPr>
+          <w:p>
+            <w:pPr>
+              <w:spacing w:after="0" w:line="252"/>
+            </w:pPr>
+            <w:r>
+              <w:rPr>
+                <w:rFonts w:ascii="Calibri" w:cs="Calibri" w:eastAsia="Calibri" w:hAnsi="Calibri"/>
+                <w:b w:val="false"/>
+                <w:bCs w:val="false"/>
+                <w:sz w:val="19"/>
+                <w:szCs w:val="19"/>
+              </w:rPr>
               <w:t xml:space="preserve">401/403 from JRS</w:t>
             </w:r>
           </w:p>
@@ -10465,7 +10852,7 @@
           <w:sz w:val="22"/>
           <w:szCs w:val="22"/>
         </w:rPr>
-        <w:t xml:space="preserve">Development followed test-first: every production class was written against a test that was first seen to fail. The suite has 114 tests and runs in about a minute. An independent whole-branch code review (fresh context, most capable model) was performed after implementation; its Critical and Important findings were fixed test-first (see §14) and its minor findings are tracked in §15.</w:t>
+        <w:t xml:space="preserve">Development followed test-first: every production class was written against a test that was first seen to fail. The suite has 118 tests and runs in about a minute. An independent whole-branch code review (fresh context, most capable model) was performed after implementation; its Critical and Important findings were fixed test-first (see §14) and its minor findings are tracked in §15.</w:t>
       </w:r>
     </w:p>
     <w:tbl>
@@ -10783,7 +11170,7 @@
                 <w:sz w:val="19"/>
                 <w:szCs w:val="19"/>
               </w:rPr>
-              <w:t xml:space="preserve">JR6 and JR7 JRXML, DOCTYPE JRXML offline, XXE rejected, inline vs referenced JRXML, missing JRXML, subreport resolution, SQL redaction, every datasource flavour and credential stripping, Domain join trees and queries, dashboard tiles/layout/wiring and fallbacks, Mondrian shared dimensions, OLAP connections and views, generic types.</w:t>
+              <w:t xml:space="preserve">JR6 and JR7 JRXML, DOCTYPE JRXML offline, XXE rejected, inline vs referenced JRXML, missing JRXML, subreport resolution, SQL redaction, every datasource flavour and credential stripping, Domain join trees and queries, dashboard tiles/layout/wiring, embedded designer views and fallbacks, live JRS 10 descriptor shapes, Mondrian shared dimensions, OLAP connections and views, generic types.</w:t>
             </w:r>
           </w:p>
         </w:tc>
@@ -11045,7 +11432,7 @@
                 <w:sz w:val="19"/>
                 <w:szCs w:val="19"/>
               </w:rPr>
-              <w:t xml:space="preserve">LiveSmokeIT (env-gated, excluded by default)</w:t>
+              <w:t xml:space="preserve">LiveSmokeIT (env-gated, excluded by default) and a full crawl from /</w:t>
             </w:r>
           </w:p>
         </w:tc>
@@ -11077,7 +11464,7 @@
                 <w:sz w:val="19"/>
                 <w:szCs w:val="19"/>
               </w:rPr>
-              <w:t xml:space="preserve">serverInfo and listing; full crawl of one folder asserting the Phase 1 exit criterion (≥95% ingested). Not yet executed: no server credentials were available.</w:t>
+              <w:t xml:space="preserve">Executed 2026-10-12 against JasperReports Server 10.0.0 PRO (build 20260730_0457): serverInfo, listing and the Phase 1 exit criterion (≥95% ingested) pass. Full crawl: 1,233 resources, 0 failures, 3,968 assets, 586 edges, 21 shadow datasources, 0 unresolved edges; the remaining 234 warnings are all permission 403s on /themes/* files. The live run surfaced four payload-shape findings that were fixed test-first (section 14).</w:t>
             </w:r>
           </w:p>
         </w:tc>
@@ -12748,7 +13135,7 @@
                 <w:sz w:val="19"/>
                 <w:szCs w:val="19"/>
               </w:rPr>
-              <w:t xml:space="preserve">Live smoke test not executed</w:t>
+              <w:t xml:space="preserve">Live-run findings fixed test-first (rev 1.1)</w:t>
             </w:r>
           </w:p>
         </w:tc>
@@ -12780,7 +13167,7 @@
                 <w:sz w:val="19"/>
                 <w:szCs w:val="19"/>
               </w:rPr>
-              <w:t xml:space="preserve">No JRS credentials in the build environment.</w:t>
+              <w:t xml:space="preserve">The first live crawl showed four mismatches with the live JRS 10 payloads: companion resources arrive as resources:{resource:[...]}; sample reports use relative repo:Name.jrxml subreport expressions; references into a report's own _files/ folder are never listed and were reported as unresolved; designer dashboards reference /temp/tmpAdv_* views that exist only inside the export.</w:t>
             </w:r>
           </w:p>
         </w:tc>
@@ -12812,7 +13199,105 @@
                 <w:sz w:val="19"/>
                 <w:szCs w:val="19"/>
               </w:rPr>
-              <w:t xml:space="preserve">Payload-shape mismatches on a real server surface only at first run; a probe + dry run is recommended before the first crawl.</w:t>
+              <w:t xml:space="preserve">Other server versions may expose further shape differences; the parsers accept both shapes where known.</w:t>
+            </w:r>
+          </w:p>
+        </w:tc>
+      </w:tr>
+      <w:tr>
+        <w:tc>
+          <w:tcPr>
+            <w:tcW w:type="dxa" w:w="3150"/>
+            <w:tcBorders>
+              <w:top w:val="single" w:color="BFBFBF" w:sz="4"/>
+              <w:left w:val="single" w:color="BFBFBF" w:sz="4"/>
+              <w:bottom w:val="single" w:color="BFBFBF" w:sz="4"/>
+              <w:right w:val="single" w:color="BFBFBF" w:sz="4"/>
+            </w:tcBorders>
+            <w:tcMar>
+              <w:top w:type="dxa" w:w="60"/>
+              <w:left w:type="dxa" w:w="100"/>
+              <w:bottom w:type="dxa" w:w="60"/>
+              <w:right w:type="dxa" w:w="100"/>
+            </w:tcMar>
+          </w:tcPr>
+          <w:p>
+            <w:pPr>
+              <w:spacing w:after="0" w:line="252"/>
+            </w:pPr>
+            <w:r>
+              <w:rPr>
+                <w:rFonts w:ascii="Calibri" w:cs="Calibri" w:eastAsia="Calibri" w:hAnsi="Calibri"/>
+                <w:b w:val="false"/>
+                <w:bCs w:val="false"/>
+                <w:sz w:val="19"/>
+                <w:szCs w:val="19"/>
+              </w:rPr>
+              <w:t xml:space="preserve">Embedded designer ad hoc views resolved through the export descriptor</w:t>
+            </w:r>
+          </w:p>
+        </w:tc>
+        <w:tc>
+          <w:tcPr>
+            <w:tcW w:type="dxa" w:w="4200"/>
+            <w:tcBorders>
+              <w:top w:val="single" w:color="BFBFBF" w:sz="4"/>
+              <w:left w:val="single" w:color="BFBFBF" w:sz="4"/>
+              <w:bottom w:val="single" w:color="BFBFBF" w:sz="4"/>
+              <w:right w:val="single" w:color="BFBFBF" w:sz="4"/>
+            </w:tcBorders>
+            <w:tcMar>
+              <w:top w:type="dxa" w:w="60"/>
+              <w:left w:type="dxa" w:w="100"/>
+              <w:bottom w:type="dxa" w:w="60"/>
+              <w:right w:type="dxa" w:w="100"/>
+            </w:tcMar>
+          </w:tcPr>
+          <w:p>
+            <w:pPr>
+              <w:spacing w:after="0" w:line="252"/>
+            </w:pPr>
+            <w:r>
+              <w:rPr>
+                <w:rFonts w:ascii="Calibri" w:cs="Calibri" w:eastAsia="Calibri" w:hAnsi="Calibri"/>
+                <w:b w:val="false"/>
+                <w:bCs w:val="false"/>
+                <w:sz w:val="19"/>
+                <w:szCs w:val="19"/>
+              </w:rPr>
+              <w:t xml:space="preserve">The alternative, skipping /temp references, would leave every designer-built chart tile without lineage. Reading the localResource entries gives EXACT edges to the Domain/Topic the view queries, and cataloging the view as a child of the dashboard keeps its identity stable across runs (6.4.1).</w:t>
+            </w:r>
+          </w:p>
+        </w:tc>
+        <w:tc>
+          <w:tcPr>
+            <w:tcW w:type="dxa" w:w="2730"/>
+            <w:tcBorders>
+              <w:top w:val="single" w:color="BFBFBF" w:sz="4"/>
+              <w:left w:val="single" w:color="BFBFBF" w:sz="4"/>
+              <w:bottom w:val="single" w:color="BFBFBF" w:sz="4"/>
+              <w:right w:val="single" w:color="BFBFBF" w:sz="4"/>
+            </w:tcBorders>
+            <w:tcMar>
+              <w:top w:type="dxa" w:w="60"/>
+              <w:left w:type="dxa" w:w="100"/>
+              <w:bottom w:type="dxa" w:w="60"/>
+              <w:right w:type="dxa" w:w="100"/>
+            </w:tcMar>
+          </w:tcPr>
+          <w:p>
+            <w:pPr>
+              <w:spacing w:after="0" w:line="252"/>
+            </w:pPr>
+            <w:r>
+              <w:rPr>
+                <w:rFonts w:ascii="Calibri" w:cs="Calibri" w:eastAsia="Calibri" w:hAnsi="Calibri"/>
+                <w:b w:val="false"/>
+                <w:bCs w:val="false"/>
+                <w:sz w:val="19"/>
+                <w:szCs w:val="19"/>
+              </w:rPr>
+              <w:t xml:space="preserve">Embedded views are children of the dashboard, so moving a view to the repository later changes its asset id; the dashboard asset carries embeddedViewCount for reconciliation.</w:t>
             </w:r>
           </w:p>
         </w:tc>

</xml_diff>